<commit_message>
docs(patent): add PDF and DOCX exports of patent draft v1
Co-Authored-By: Claude Sonnet 4.6 <noreply@anthropic.com>
</commit_message>
<xml_diff>
--- a/docs/patent_draft_v1.docx
+++ b/docs/patent_draft_v1.docx
@@ -233,6 +233,14 @@
         <w:pStyle w:val="BodyText"/>
       </w:pPr>
       <w:r>
+        <w:t xml:space="preserve">종래 기술에서는 제로샷 에너지 예측 성능이 학습 데이터의 규모에 비례한다는 것이 지배적 가정이었다. 소규모 데이터의 운영 패턴 다양성을 체계적으로 설계함으로써 대규모 데이터를 대체하는 접근은 당업자에게 자명하지 않았으며, 실제로 BuildingsBench에서도 0.067 에포크만으로 과적합이 발생하였으나 이를 다양성 문제로 재해석하는 시도는 없었다.</w:t>
+      </w:r>
+    </w:p>
+    <w:p>
+      <w:pPr>
+        <w:pStyle w:val="BodyText"/>
+      </w:pPr>
+      <w:r>
         <w:t xml:space="preserve">따라서 소규모의 시뮬레이션 데이터만으로도 대규모 데이터 기반 모델과 동등한 성능을 달성하면서, 위치 정보 없이도 범용적으로 적용 가능한 건물 에너지 예측 기술이 요구된다.</w:t>
       </w:r>
     </w:p>
@@ -363,7 +371,7 @@
         <w:pStyle w:val="BodyText"/>
       </w:pPr>
       <w:r>
-        <w:t xml:space="preserve">첫째, 700동 수준의 소규모 파라메트릭 시뮬레이션 데이터만으로 90만 동의 대규모 데이터 기반 모델과 동등하거나 우수한 예측 성능을 달성할 수 있다. 실험 결과, 955동의 상업용 건물에 대한 제로샷 평가에서 5-시드 평균 중앙값 CVRMSE 13.11 ± 0.16%(최고 시드 12.93%)를 달성하여, 종래 기술의 13.27% 대비 동등 수준(최고 시드는 0.34%p 개선)을 확인하였다.</w:t>
+        <w:t xml:space="preserve">첫째, 700동 수준의 소규모 파라메트릭 시뮬레이션 데이터만으로 90만 동의 대규모 데이터 기반 모델과 동등하거나 우수한 예측 성능을 달성할 수 있다. 실험 결과, 955동의 상업용 건물에 대한 제로샷 평가에서 5-시드 평균 중앙값 CVRMSE 13.11 ± 0.17%(최고 시드 12.93%)를 달성하여, 종래 기술의 13.27% 대비 동등 수준(최고 시드는 0.34%p 개선)을 확인하였다.</w:t>
       </w:r>
     </w:p>
     <w:p>
@@ -1530,7 +1538,7 @@
               <w:jc w:val="center"/>
             </w:pPr>
             <w:r>
-              <w:t xml:space="preserve">13.11 ± 0.16</w:t>
+              <w:t xml:space="preserve">13.11 ± 0.17</w:t>
             </w:r>
           </w:p>
         </w:tc>
@@ -1682,13 +1690,62 @@
           </w:p>
         </w:tc>
       </w:tr>
+      <w:tr>
+        <w:tc>
+          <w:tcPr/>
+          <w:p>
+            <w:pPr>
+              <w:pStyle w:val="Compact"/>
+            </w:pPr>
+            <w:r>
+              <w:t xml:space="preserve">종래 데이터 700동 + RevIN + 데이터증강</w:t>
+            </w:r>
+          </w:p>
+        </w:tc>
+        <w:tc>
+          <w:tcPr/>
+          <w:p>
+            <w:pPr>
+              <w:pStyle w:val="Compact"/>
+              <w:jc w:val="center"/>
+            </w:pPr>
+            <w:r>
+              <w:t xml:space="preserve">700</w:t>
+            </w:r>
+          </w:p>
+        </w:tc>
+        <w:tc>
+          <w:tcPr/>
+          <w:p>
+            <w:pPr>
+              <w:pStyle w:val="Compact"/>
+              <w:jc w:val="center"/>
+            </w:pPr>
+            <w:r>
+              <w:t xml:space="preserve">미사용</w:t>
+            </w:r>
+          </w:p>
+        </w:tc>
+        <w:tc>
+          <w:tcPr/>
+          <w:p>
+            <w:pPr>
+              <w:pStyle w:val="Compact"/>
+              <w:jc w:val="center"/>
+            </w:pPr>
+            <w:r>
+              <w:t xml:space="preserve">14.26</w:t>
+            </w:r>
+          </w:p>
+        </w:tc>
+      </w:tr>
     </w:tbl>
     <w:p>
       <w:pPr>
         <w:pStyle w:val="BodyText"/>
       </w:pPr>
       <w:r>
-        <w:t xml:space="preserve">본 발명에 의한 700동 학습 모델(RevIN 적용, 5-시드 평균)은 종래 기술의 900,000동 학습 모델과 동등한 CVRMSE 13.11 ± 0.16%를 달성하였으며, 최고 시드는 12.93%로 종래 기술 대비 0.34%p 개선되었다. 동일한 700동이라도 본 발명의 파라메트릭 시뮬레이션 데이터가 종래 데이터(15.28%) 대비 2.17%p 우수하여(데이터 설계 효과), RevIN 효과(1.61%p)보다 데이터 설계의 기여도가 더 큼이 확인되었다.</w:t>
+        <w:t xml:space="preserve">본 발명에 의한 700동 학습 모델(RevIN 적용, 5-시드 평균)은 종래 기술의 900,000동 학습 모델과 동등한 CVRMSE 13.11 ± 0.17%를 달성하였으며, 최고 시드는 12.93%로 종래 기술 대비 0.34%p 개선되었다. 동일한 700동이라도 본 발명의 파라메트릭 시뮬레이션 데이터는 종래 데이터에 데이터증강을 적용한 가장 유리한 조건(14.26%) 대비 1.15%p, 데이터증강 미적용 종래 데이터(15.28%) 대비 2.17%p 우수하였다(데이터 설계 효과). 이는 RevIN 효과(1.61%p)보다 데이터 설계의 기여도가 더 큼을 의미한다.</w:t>
       </w:r>
     </w:p>
     <w:p>
@@ -2390,7 +2447,7 @@
         <w:pStyle w:val="BodyText"/>
       </w:pPr>
       <w:r>
-        <w:t xml:space="preserve">상기 학습 데이터에 Box-Cox 변환을 적용하고 시계열 윈도우를 생성하는 데이터 전처리부;</w:t>
+        <w:t xml:space="preserve">상기 학습 데이터로부터 시계열 윈도우를 생성하는 데이터 전처리부;</w:t>
       </w:r>
     </w:p>
     <w:p>
@@ -2438,7 +2495,7 @@
         <w:t xml:space="preserve"> </w:t>
       </w:r>
       <w:r>
-        <w:t xml:space="preserve">상기 파라미터 생성부는, 운영 시작 시각, 운영 지속 시간, 기저부하 비율, 야간 장비 잔류 비율, 계절별 부하 진폭, 및 상시 공정 부하 비율을 포함하는 12개 이상의 연속 파라미터를 생성하는 것을 특징으로 하는 건물 에너지 소비 예측 시스템.</w:t>
+        <w:t xml:space="preserve">상기 파라미터 생성부는, 운영 시작 시각(op_start), 운영 지속 시간(op_duration), 기저부하 비율(baseload_pct), 주말 부하 비율(weekend_factor), 전환 경사 시간(ramp_hours), 상시 가동 장비 비율(equip_always_on), 일별 변동 노이즈(daily_noise_std), 부하 밀도 배율(scale_mult), 야간 장비 잔류 비율(night_equipment_frac), 주별 패턴 이탈 확률(weekly_break_prob), 계절별 부하 진폭(seasonal_amplitude), 및 상시 공정 부하 비율(process_load_frac)의 12개의 연속 파라미터를 생성하는 것을 특징으로 하는 건물 에너지 소비 예측 시스템.</w:t>
       </w:r>
     </w:p>
     <w:bookmarkEnd w:id="33"/>
@@ -2494,7 +2551,7 @@
         <w:t xml:space="preserve"> </w:t>
       </w:r>
       <w:r>
-        <w:t xml:space="preserve">복수의 건물 아키타입 각각에 대하여 건물 운영 파라미터를 다차원 라틴 하이퍼큐브 샘플링에 의해 생성하는 동작;</w:t>
+        <w:t xml:space="preserve">복수의 건물 아키타입 각각에 대하여 건물 운영 시작 시각, 운영 지속 시간, 기저부하 비율, 주말 부하 비율, 야간 장비 잔류 비율, 일별 변동 노이즈, 및 부하 밀도 배율을 포함하는 복수의 운영 파라미터를 다차원 라틴 하이퍼큐브 샘플링에 의해 생성하는 동작;</w:t>
       </w:r>
       <w:r>
         <w:t xml:space="preserve"> </w:t>
@@ -2548,7 +2605,7 @@
         <w:pStyle w:val="FirstParagraph"/>
       </w:pPr>
       <w:r>
-        <w:t xml:space="preserve">본 발명은 소규모의 파라메트릭 시뮬레이션 데이터를 이용한 건물 에너지 소비 예측 방법 및 시스템에 관한 것이다. 12차원 라틴 하이퍼큐브 샘플링으로 건물 운영 파라미터를 생성하고, 에너지 시뮬레이션에 의해 학습 데이터를 구축한 후, 역변환 가능한 인스턴스 정규화와 트랜스포머 모델을 결합하여 학습한다. 학습된 모델은 예측 대상 건물의 위치 정보 없이 에너지 소비 이력만으로 미래 소비를 예측한다. 700동의 시뮬레이션 데이터로 학습한 모델이 90만 동의 종래 기술 대비 동등 이상의 예측 성능(CVRMSE 13.11 ± 0.16% (5-시드 평균, 최고 시드 12.93%) vs 13.27%)을 달성한다.</w:t>
+        <w:t xml:space="preserve">본 발명은 소규모의 파라메트릭 시뮬레이션 데이터를 이용한 건물 에너지 소비 예측 방법 및 시스템에 관한 것이다. 12차원 라틴 하이퍼큐브 샘플링으로 건물 운영 파라미터를 생성하고, 에너지 시뮬레이션에 의해 학습 데이터를 구축한 후, 역변환 가능한 인스턴스 정규화와 트랜스포머 모델을 결합하여 학습한다. 학습된 모델은 예측 대상 건물의 위치 정보 없이 에너지 소비 이력만으로 미래 소비를 예측한다. 700동의 시뮬레이션 데이터로 학습한 모델이 90만 동의 종래 기술 대비 동등 이상의 예측 성능(CVRMSE 13.11 ± 0.17% (5-시드 평균, 최고 시드 12.93%) vs 13.27%)을 달성한다.</w:t>
       </w:r>
     </w:p>
     <w:bookmarkEnd w:id="37"/>

</xml_diff>